<commit_message>
Align published claim policies, portal guidance and downloadable booklet
</commit_message>
<xml_diff>
--- a/public/SHENA_Companion_Policy_Booklet.docx
+++ b/public/SHENA_Companion_Policy_Booklet.docx
@@ -2803,13 +2803,9 @@
       </w:r>
     </w:p>
     <w:p>
-      <w:r>
-        <w:br w:type="page"/>
-      </w:r>
-    </w:p>
-    <w:p>
       <w:pPr>
         <w:pStyle w:val="2"/>
+        <w:pageBreakBefore/>
       </w:pPr>
       <w:r>
         <w:rPr>
@@ -2823,7 +2819,7 @@
         <w:jc w:val="both"/>
       </w:pPr>
       <w:r>
-        <w:t>When a covered member passes away, the family or next of kin must follow the proper claims process to access the funeral benefits. SHENA Companion strives to process claims promptly to ease the burden on grieving families during this difficult time.</w:t>
+        <w:t>When a covered member or dependant dies, call SHENA and file a claim through the member portal. An administrator may file on the member's behalf. Filing without attachments is allowed; the application remains incomplete for final approval until the required proof is uploaded and reviewed.</w:t>
       </w:r>
     </w:p>
     <w:p>
@@ -2853,7 +2849,7 @@
         <w:jc w:val="both"/>
       </w:pPr>
       <w:r>
-        <w:t>A clear photocopy of the national identification card (ID) for the deceased must be provided. If the deceased is an adult (18 years and above), submit a photocopy of their national ID card. If the deceased is a child (below 18 years), submit a photocopy of their birth certificate. Additionally, provide a photocopy of the principal member's national ID to verify the relationship and membership status.</w:t>
+        <w:t>Upload a clear copy of the deceased adult's National ID, or a birth certificate for a child. A death certificate may be added as optional supporting evidence.</w:t>
       </w:r>
     </w:p>
     <w:p>
@@ -2921,7 +2917,7 @@
         <w:jc w:val="both"/>
       </w:pPr>
       <w:r>
-        <w:t>Immediately after the death of a covered member, the next of kin or family representative should contact SHENA Companion to report the death by calling 0748585067 or 0748585071, visiting the office in person at P.O. Box 4018, 40100-Kisumu, or emailing the contact address. During this initial contact, provide basic information including the name of the deceased, the member account number, date of death, and location where the body is preserved.</w:t>
+        <w:t>Call 0748585067 or 0748585071 promptly to report the loss. Provide the deceased person's name, member number, date of death and mortuary details.</w:t>
       </w:r>
     </w:p>
     <w:p>
@@ -2932,7 +2928,7 @@
         <w:rPr>
           <w:color w:val="4B0082"/>
         </w:rPr>
-        <w:t>Step 2: Gather Required Documents</w:t>
+        <w:t>Step 2 File the initial application</w:t>
       </w:r>
     </w:p>
     <w:p>
@@ -2940,7 +2936,7 @@
         <w:jc w:val="both"/>
       </w:pPr>
       <w:r>
-        <w:t>Collect all three required documents as listed above. Ensure that all documents are clear, complete, and properly signed and stamped where necessary.</w:t>
+        <w:t>File through the member portal within the existing 30-day window from the date of death. An administrator may file on your behalf. Attachments are optional at this stage. A receipt with next steps is queued for the member and both configured office phones, with an immediate sending attempt.</w:t>
       </w:r>
     </w:p>
     <w:p>
@@ -2951,7 +2947,7 @@
         <w:rPr>
           <w:color w:val="4B0082"/>
         </w:rPr>
-        <w:t>Step 3: Submit Documents</w:t>
+        <w:t>Step 3 Upload proof within seven days</w:t>
       </w:r>
     </w:p>
     <w:p>
@@ -2959,7 +2955,7 @@
         <w:jc w:val="both"/>
       </w:pPr>
       <w:r>
-        <w:t>Submit all required documents to the SHENA Companion office in person, through a designated agent, or via email (scanned copies) followed by physical submission before funeral services.</w:t>
+        <w:t>Return to Documents and next steps in the member portal. Upload the ID/birth certificate, chief letter and mortuary invoice within 7 days from the original application date and time, in East Africa Time (EAT). The member or administrator must upload these, including for admin-filed claims. PDF, JPG or PNG files are accepted, up to 5 MB each. This document deadline is separate from the 30-day filing window.</w:t>
       </w:r>
     </w:p>
     <w:p>
@@ -2970,7 +2966,7 @@
         <w:rPr>
           <w:color w:val="4B0082"/>
         </w:rPr>
-        <w:t>Step 4: Claim Verification and Processing</w:t>
+        <w:t>Step 4 Initial verification and final approval</w:t>
       </w:r>
     </w:p>
     <w:p>
@@ -2978,7 +2974,7 @@
         <w:jc w:val="both"/>
       </w:pPr>
       <w:r>
-        <w:t>SHENA Companion will verify that the deceased is a registered member or covered dependent, the membership is active and not in default, the maturity period has been completed, all required documents are complete and authentic, and the cause of death is not excluded under policy terms. This verification process typically takes 1-3 business days.</w:t>
+        <w:t>An administrator verifies and accepts the initial application for document review. Preliminary acceptance is not final approval and does not restart the seven-day deadline. Documents may be uploaded before acceptance. Final service or cash approval, processing and completion require all proof and existing eligibility checks. If evidence is late, upload it and contact the office. An administrator must record a reason for a deadline exception; it never waives proof or eligibility. Lateness alone does not automatically reject a claim.</w:t>
       </w:r>
     </w:p>
     <w:p>
@@ -3001,6 +2997,23 @@
       </w:r>
     </w:p>
     <w:p>
+      <w:pPr>
+        <w:pStyle w:val="3"/>
+      </w:pPr>
+      <w:r>
+        <w:rPr>
+          <w:color w:val="4B0082"/>
+        </w:rPr>
+        <w:t>Hospital and bed cover documents</w:t>
+      </w:r>
+    </w:p>
+    <w:p>
+      <w:pPr/>
+      <w:r>
+        <w:t>Upload admission proof identifying the patient, hospital and admission date through the member portal by 23:59:59 EAT on admission day. If unavailable, call 0748585067 or 0748585071 immediately for guidance. These rules also apply when an administrator files the request. An administrator must record the reason for allowing late evidence; a call alone does not waive proof. Approval, including partial approval, requires proof and the existing coverage, maturity, contribution and available-day checks. PDF, JPG or PNG files are accepted, up to 5 MB each.</w:t>
+      </w:r>
+    </w:p>
+    <w:p>
       <w:r>
         <w:br w:type="page"/>
       </w:r>
@@ -3127,7 +3140,7 @@
         <w:jc w:val="both"/>
       </w:pPr>
       <w:r>
-        <w:t>All three required documents must be submitted: Photocopy of ID/Birth Certificate, Letter from the area chief, and Invoice from the mortuary. Claims with incomplete documentation will not be processed.</w:t>
+        <w:t>The ID/birth certificate copy, chief letter and mortuary invoice must be uploaded within seven days of filing. Incomplete claims cannot proceed to final service or cash approval, processing or completion. Admin-filed claims have the same requirements; late evidence requires a recorded admin exception.</w:t>
       </w:r>
     </w:p>
     <w:p>

</xml_diff>